<commit_message>
Standardise titles, footers and metadata across Italian publication suite
</commit_message>
<xml_diff>
--- a/01-projects/001-from-wildfires-to-regeneration/04-publication/IT/IT-Documento-per-il-Consiglio-Direttivo.docx
+++ b/01-projects/001-from-wildfires-to-regeneration/04-publication/IT/IT-Documento-per-il-Consiglio-Direttivo.docx
@@ -21,7 +21,7 @@
           <w:sz w:val="92"/>
           <w:szCs w:val="92"/>
         </w:rPr>
-        <w:t>From Wildfires to Regeneration</w:t>
+        <w:t>Documento per il Consiglio Direttivo</w:t>
       </w:r>
     </w:p>
     <w:p>
@@ -36,7 +36,7 @@
           <w:sz w:val="21"/>
           <w:szCs w:val="21"/>
         </w:rPr>
-        <w:t>Una Risposta Rapida Globale Pratica, Scalabile ed Esportabile</w:t>
+        <w:t>From Wildfires to Regeneration — Una Risposta Rapida Globale Pratica, Scalabile ed Esportabile</w:t>
       </w:r>
     </w:p>
     <w:p>
@@ -2368,7 +2368,12 @@
       </w:r>
     </w:p>
     <w:sectPr>
-      <w:footerReference w:type="default" r:id="rId7"/>
+      <w:headerReference w:type="even" r:id="rId7"/>
+      <w:headerReference w:type="default" r:id="rId8"/>
+      <w:footerReference w:type="even" r:id="rId9"/>
+      <w:footerReference w:type="default" r:id="rId10"/>
+      <w:headerReference w:type="first" r:id="rId11"/>
+      <w:footerReference w:type="first" r:id="rId12"/>
       <w:pgSz w:w="11906" w:h="16838"/>
       <w:pgMar w:top="2160" w:right="2160" w:bottom="2160" w:left="2160" w:header="708" w:footer="708" w:gutter="0"/>
       <w:cols w:space="720"/>
@@ -2401,8 +2406,27 @@
 <w:ftr xmlns:wpc="http://schemas.microsoft.com/office/word/2010/wordprocessingCanvas" xmlns:cx="http://schemas.microsoft.com/office/drawing/2014/chartex" xmlns:cx1="http://schemas.microsoft.com/office/drawing/2015/9/8/chartex" xmlns:cx2="http://schemas.microsoft.com/office/drawing/2015/10/21/chartex" xmlns:cx3="http://schemas.microsoft.com/office/drawing/2016/5/9/chartex" xmlns:cx4="http://schemas.microsoft.com/office/drawing/2016/5/10/chartex" xmlns:cx5="http://schemas.microsoft.com/office/drawing/2016/5/11/chartex" xmlns:cx6="http://schemas.microsoft.com/office/drawing/2016/5/12/chartex" xmlns:cx7="http://schemas.microsoft.com/office/drawing/2016/5/13/chartex" xmlns:cx8="http://schemas.microsoft.com/office/drawing/2016/5/14/chartex" xmlns:mc="http://schemas.openxmlformats.org/markup-compatibility/2006" xmlns:aink="http://schemas.microsoft.com/office/drawing/2016/ink" xmlns:am3d="http://schemas.microsoft.com/office/drawing/2017/model3d" xmlns:o="urn:schemas-microsoft-com:office:office" xmlns:r="http://schemas.openxmlformats.org/officeDocument/2006/relationships" xmlns:m="http://schemas.openxmlformats.org/officeDocument/2006/math" xmlns:v="urn:schemas-microsoft-com:vml" xmlns:wp14="http://schemas.microsoft.com/office/word/2010/wordprocessingDrawing" xmlns:wp="http://schemas.openxmlformats.org/drawingml/2006/wordprocessingDrawing" xmlns:w10="urn:schemas-microsoft-com:office:word" xmlns:w="http://schemas.openxmlformats.org/wordprocessingml/2006/main" xmlns:w14="http://schemas.microsoft.com/office/word/2010/wordml" xmlns:w15="http://schemas.microsoft.com/office/word/2012/wordml" xmlns:w16cid="http://schemas.microsoft.com/office/word/2016/wordml/cid" xmlns:w16se="http://schemas.microsoft.com/office/word/2015/wordml/symex" xmlns:wpg="http://schemas.microsoft.com/office/word/2010/wordprocessingGroup" xmlns:wpi="http://schemas.microsoft.com/office/word/2010/wordprocessingInk" xmlns:wne="http://schemas.microsoft.com/office/word/2006/wordml" xmlns:wps="http://schemas.microsoft.com/office/word/2010/wordprocessingShape" mc:Ignorable="w14 w15 w16se w16cid wp14">
   <w:p>
     <w:pPr>
+      <w:pStyle w:val="Footer"/>
+    </w:pPr>
+  </w:p>
+</w:ftr>
+</file>
+
+<file path=word/footer2.xml><?xml version="1.0" encoding="utf-8"?>
+<w:ftr xmlns:wpc="http://schemas.microsoft.com/office/word/2010/wordprocessingCanvas" xmlns:cx="http://schemas.microsoft.com/office/drawing/2014/chartex" xmlns:cx1="http://schemas.microsoft.com/office/drawing/2015/9/8/chartex" xmlns:cx2="http://schemas.microsoft.com/office/drawing/2015/10/21/chartex" xmlns:cx3="http://schemas.microsoft.com/office/drawing/2016/5/9/chartex" xmlns:cx4="http://schemas.microsoft.com/office/drawing/2016/5/10/chartex" xmlns:cx5="http://schemas.microsoft.com/office/drawing/2016/5/11/chartex" xmlns:cx6="http://schemas.microsoft.com/office/drawing/2016/5/12/chartex" xmlns:cx7="http://schemas.microsoft.com/office/drawing/2016/5/13/chartex" xmlns:cx8="http://schemas.microsoft.com/office/drawing/2016/5/14/chartex" xmlns:mc="http://schemas.openxmlformats.org/markup-compatibility/2006" xmlns:aink="http://schemas.microsoft.com/office/drawing/2016/ink" xmlns:am3d="http://schemas.microsoft.com/office/drawing/2017/model3d" xmlns:o="urn:schemas-microsoft-com:office:office" xmlns:r="http://schemas.openxmlformats.org/officeDocument/2006/relationships" xmlns:m="http://schemas.openxmlformats.org/officeDocument/2006/math" xmlns:v="urn:schemas-microsoft-com:vml" xmlns:wp14="http://schemas.microsoft.com/office/word/2010/wordprocessingDrawing" xmlns:wp="http://schemas.openxmlformats.org/drawingml/2006/wordprocessingDrawing" xmlns:w10="urn:schemas-microsoft-com:office:word" xmlns:w="http://schemas.openxmlformats.org/wordprocessingml/2006/main" xmlns:w14="http://schemas.microsoft.com/office/word/2010/wordml" xmlns:w15="http://schemas.microsoft.com/office/word/2012/wordml" xmlns:w16cid="http://schemas.microsoft.com/office/word/2016/wordml/cid" xmlns:w16se="http://schemas.microsoft.com/office/word/2015/wordml/symex" xmlns:wpg="http://schemas.microsoft.com/office/word/2010/wordprocessingGroup" xmlns:wpi="http://schemas.microsoft.com/office/word/2010/wordprocessingInk" xmlns:wne="http://schemas.microsoft.com/office/word/2006/wordml" xmlns:wps="http://schemas.microsoft.com/office/word/2010/wordprocessingShape" mc:Ignorable="w14 w15 w16se w16cid wp14">
+  <w:p>
+    <w:pPr>
       <w:jc w:val="center"/>
     </w:pPr>
+    <w:r>
+      <w:rPr>
+        <w:rFonts w:ascii="Avenir" w:eastAsia="Avenir" w:hAnsi="Avenir" w:cs="Avenir"/>
+        <w:color w:val="A8A296"/>
+        <w:sz w:val="15"/>
+        <w:szCs w:val="15"/>
+      </w:rPr>
+      <w:t xml:space="preserve">DOCUMENTO PER IL CONSIGLIO DIRETTIVO   ·   FROM WILDFIRES TO REGENERATION   ·   </w:t>
+    </w:r>
     <w:r>
       <w:rPr>
         <w:rFonts w:ascii="Avenir" w:eastAsia="Avenir" w:hAnsi="Avenir" w:cs="Avenir"/>
@@ -2419,7 +2443,7 @@
         <w:sz w:val="15"/>
         <w:szCs w:val="15"/>
       </w:rPr>
-      <w:instrText>PAGE</w:instrText>
+      <w:instrText xml:space="preserve"> PAGE  \* MERGEFORMAT </w:instrText>
     </w:r>
     <w:r>
       <w:rPr>
@@ -2438,7 +2462,7 @@
         <w:sz w:val="15"/>
         <w:szCs w:val="15"/>
       </w:rPr>
-      <w:t>1</w:t>
+      <w:t>2</w:t>
     </w:r>
     <w:r>
       <w:rPr>
@@ -2453,6 +2477,16 @@
 </w:ftr>
 </file>
 
+<file path=word/footer3.xml><?xml version="1.0" encoding="utf-8"?>
+<w:ftr xmlns:wpc="http://schemas.microsoft.com/office/word/2010/wordprocessingCanvas" xmlns:cx="http://schemas.microsoft.com/office/drawing/2014/chartex" xmlns:cx1="http://schemas.microsoft.com/office/drawing/2015/9/8/chartex" xmlns:cx2="http://schemas.microsoft.com/office/drawing/2015/10/21/chartex" xmlns:cx3="http://schemas.microsoft.com/office/drawing/2016/5/9/chartex" xmlns:cx4="http://schemas.microsoft.com/office/drawing/2016/5/10/chartex" xmlns:cx5="http://schemas.microsoft.com/office/drawing/2016/5/11/chartex" xmlns:cx6="http://schemas.microsoft.com/office/drawing/2016/5/12/chartex" xmlns:cx7="http://schemas.microsoft.com/office/drawing/2016/5/13/chartex" xmlns:cx8="http://schemas.microsoft.com/office/drawing/2016/5/14/chartex" xmlns:mc="http://schemas.openxmlformats.org/markup-compatibility/2006" xmlns:aink="http://schemas.microsoft.com/office/drawing/2016/ink" xmlns:am3d="http://schemas.microsoft.com/office/drawing/2017/model3d" xmlns:o="urn:schemas-microsoft-com:office:office" xmlns:r="http://schemas.openxmlformats.org/officeDocument/2006/relationships" xmlns:m="http://schemas.openxmlformats.org/officeDocument/2006/math" xmlns:v="urn:schemas-microsoft-com:vml" xmlns:wp14="http://schemas.microsoft.com/office/word/2010/wordprocessingDrawing" xmlns:wp="http://schemas.openxmlformats.org/drawingml/2006/wordprocessingDrawing" xmlns:w10="urn:schemas-microsoft-com:office:word" xmlns:w="http://schemas.openxmlformats.org/wordprocessingml/2006/main" xmlns:w14="http://schemas.microsoft.com/office/word/2010/wordml" xmlns:w15="http://schemas.microsoft.com/office/word/2012/wordml" xmlns:w16cid="http://schemas.microsoft.com/office/word/2016/wordml/cid" xmlns:w16se="http://schemas.microsoft.com/office/word/2015/wordml/symex" xmlns:wpg="http://schemas.microsoft.com/office/word/2010/wordprocessingGroup" xmlns:wpi="http://schemas.microsoft.com/office/word/2010/wordprocessingInk" xmlns:wne="http://schemas.microsoft.com/office/word/2006/wordml" xmlns:wps="http://schemas.microsoft.com/office/word/2010/wordprocessingShape" mc:Ignorable="w14 w15 w16se w16cid wp14">
+  <w:p>
+    <w:pPr>
+      <w:pStyle w:val="Footer"/>
+    </w:pPr>
+  </w:p>
+</w:ftr>
+</file>
+
 <file path=word/footnotes.xml><?xml version="1.0" encoding="utf-8"?>
 <w:footnotes xmlns:wpc="http://schemas.microsoft.com/office/word/2010/wordprocessingCanvas" xmlns:cx="http://schemas.microsoft.com/office/drawing/2014/chartex" xmlns:cx1="http://schemas.microsoft.com/office/drawing/2015/9/8/chartex" xmlns:cx2="http://schemas.microsoft.com/office/drawing/2015/10/21/chartex" xmlns:cx3="http://schemas.microsoft.com/office/drawing/2016/5/9/chartex" xmlns:cx4="http://schemas.microsoft.com/office/drawing/2016/5/10/chartex" xmlns:cx5="http://schemas.microsoft.com/office/drawing/2016/5/11/chartex" xmlns:cx6="http://schemas.microsoft.com/office/drawing/2016/5/12/chartex" xmlns:cx7="http://schemas.microsoft.com/office/drawing/2016/5/13/chartex" xmlns:cx8="http://schemas.microsoft.com/office/drawing/2016/5/14/chartex" xmlns:mc="http://schemas.openxmlformats.org/markup-compatibility/2006" xmlns:aink="http://schemas.microsoft.com/office/drawing/2016/ink" xmlns:am3d="http://schemas.microsoft.com/office/drawing/2017/model3d" xmlns:o="urn:schemas-microsoft-com:office:office" xmlns:r="http://schemas.openxmlformats.org/officeDocument/2006/relationships" xmlns:m="http://schemas.openxmlformats.org/officeDocument/2006/math" xmlns:v="urn:schemas-microsoft-com:vml" xmlns:wp14="http://schemas.microsoft.com/office/word/2010/wordprocessingDrawing" xmlns:wp="http://schemas.openxmlformats.org/drawingml/2006/wordprocessingDrawing" xmlns:w10="urn:schemas-microsoft-com:office:word" xmlns:w="http://schemas.openxmlformats.org/wordprocessingml/2006/main" xmlns:w14="http://schemas.microsoft.com/office/word/2010/wordml" xmlns:w15="http://schemas.microsoft.com/office/word/2012/wordml" xmlns:w16cid="http://schemas.microsoft.com/office/word/2016/wordml/cid" xmlns:w16se="http://schemas.microsoft.com/office/word/2015/wordml/symex" xmlns:wpg="http://schemas.microsoft.com/office/word/2010/wordprocessingGroup" xmlns:wpi="http://schemas.microsoft.com/office/word/2010/wordprocessingInk" xmlns:wne="http://schemas.microsoft.com/office/word/2006/wordml" xmlns:wps="http://schemas.microsoft.com/office/word/2010/wordprocessingShape" mc:Ignorable="w14 w15 w16se w16cid wp14">
   <w:footnote w:type="separator" w:id="-1">
@@ -2470,6 +2504,36 @@
     </w:p>
   </w:footnote>
 </w:footnotes>
+</file>
+
+<file path=word/header1.xml><?xml version="1.0" encoding="utf-8"?>
+<w:hdr xmlns:wpc="http://schemas.microsoft.com/office/word/2010/wordprocessingCanvas" xmlns:cx="http://schemas.microsoft.com/office/drawing/2014/chartex" xmlns:cx1="http://schemas.microsoft.com/office/drawing/2015/9/8/chartex" xmlns:cx2="http://schemas.microsoft.com/office/drawing/2015/10/21/chartex" xmlns:cx3="http://schemas.microsoft.com/office/drawing/2016/5/9/chartex" xmlns:cx4="http://schemas.microsoft.com/office/drawing/2016/5/10/chartex" xmlns:cx5="http://schemas.microsoft.com/office/drawing/2016/5/11/chartex" xmlns:cx6="http://schemas.microsoft.com/office/drawing/2016/5/12/chartex" xmlns:cx7="http://schemas.microsoft.com/office/drawing/2016/5/13/chartex" xmlns:cx8="http://schemas.microsoft.com/office/drawing/2016/5/14/chartex" xmlns:mc="http://schemas.openxmlformats.org/markup-compatibility/2006" xmlns:aink="http://schemas.microsoft.com/office/drawing/2016/ink" xmlns:am3d="http://schemas.microsoft.com/office/drawing/2017/model3d" xmlns:o="urn:schemas-microsoft-com:office:office" xmlns:r="http://schemas.openxmlformats.org/officeDocument/2006/relationships" xmlns:m="http://schemas.openxmlformats.org/officeDocument/2006/math" xmlns:v="urn:schemas-microsoft-com:vml" xmlns:wp14="http://schemas.microsoft.com/office/word/2010/wordprocessingDrawing" xmlns:wp="http://schemas.openxmlformats.org/drawingml/2006/wordprocessingDrawing" xmlns:w10="urn:schemas-microsoft-com:office:word" xmlns:w="http://schemas.openxmlformats.org/wordprocessingml/2006/main" xmlns:w14="http://schemas.microsoft.com/office/word/2010/wordml" xmlns:w15="http://schemas.microsoft.com/office/word/2012/wordml" xmlns:w16cid="http://schemas.microsoft.com/office/word/2016/wordml/cid" xmlns:w16se="http://schemas.microsoft.com/office/word/2015/wordml/symex" xmlns:wpg="http://schemas.microsoft.com/office/word/2010/wordprocessingGroup" xmlns:wpi="http://schemas.microsoft.com/office/word/2010/wordprocessingInk" xmlns:wne="http://schemas.microsoft.com/office/word/2006/wordml" xmlns:wps="http://schemas.microsoft.com/office/word/2010/wordprocessingShape" mc:Ignorable="w14 w15 w16se w16cid wp14">
+  <w:p>
+    <w:pPr>
+      <w:pStyle w:val="Header"/>
+    </w:pPr>
+  </w:p>
+</w:hdr>
+</file>
+
+<file path=word/header2.xml><?xml version="1.0" encoding="utf-8"?>
+<w:hdr xmlns:wpc="http://schemas.microsoft.com/office/word/2010/wordprocessingCanvas" xmlns:cx="http://schemas.microsoft.com/office/drawing/2014/chartex" xmlns:cx1="http://schemas.microsoft.com/office/drawing/2015/9/8/chartex" xmlns:cx2="http://schemas.microsoft.com/office/drawing/2015/10/21/chartex" xmlns:cx3="http://schemas.microsoft.com/office/drawing/2016/5/9/chartex" xmlns:cx4="http://schemas.microsoft.com/office/drawing/2016/5/10/chartex" xmlns:cx5="http://schemas.microsoft.com/office/drawing/2016/5/11/chartex" xmlns:cx6="http://schemas.microsoft.com/office/drawing/2016/5/12/chartex" xmlns:cx7="http://schemas.microsoft.com/office/drawing/2016/5/13/chartex" xmlns:cx8="http://schemas.microsoft.com/office/drawing/2016/5/14/chartex" xmlns:mc="http://schemas.openxmlformats.org/markup-compatibility/2006" xmlns:aink="http://schemas.microsoft.com/office/drawing/2016/ink" xmlns:am3d="http://schemas.microsoft.com/office/drawing/2017/model3d" xmlns:o="urn:schemas-microsoft-com:office:office" xmlns:r="http://schemas.openxmlformats.org/officeDocument/2006/relationships" xmlns:m="http://schemas.openxmlformats.org/officeDocument/2006/math" xmlns:v="urn:schemas-microsoft-com:vml" xmlns:wp14="http://schemas.microsoft.com/office/word/2010/wordprocessingDrawing" xmlns:wp="http://schemas.openxmlformats.org/drawingml/2006/wordprocessingDrawing" xmlns:w10="urn:schemas-microsoft-com:office:word" xmlns:w="http://schemas.openxmlformats.org/wordprocessingml/2006/main" xmlns:w14="http://schemas.microsoft.com/office/word/2010/wordml" xmlns:w15="http://schemas.microsoft.com/office/word/2012/wordml" xmlns:w16cid="http://schemas.microsoft.com/office/word/2016/wordml/cid" xmlns:w16se="http://schemas.microsoft.com/office/word/2015/wordml/symex" xmlns:wpg="http://schemas.microsoft.com/office/word/2010/wordprocessingGroup" xmlns:wpi="http://schemas.microsoft.com/office/word/2010/wordprocessingInk" xmlns:wne="http://schemas.microsoft.com/office/word/2006/wordml" xmlns:wps="http://schemas.microsoft.com/office/word/2010/wordprocessingShape" mc:Ignorable="w14 w15 w16se w16cid wp14">
+  <w:p>
+    <w:pPr>
+      <w:pStyle w:val="Header"/>
+    </w:pPr>
+  </w:p>
+</w:hdr>
+</file>
+
+<file path=word/header3.xml><?xml version="1.0" encoding="utf-8"?>
+<w:hdr xmlns:wpc="http://schemas.microsoft.com/office/word/2010/wordprocessingCanvas" xmlns:cx="http://schemas.microsoft.com/office/drawing/2014/chartex" xmlns:cx1="http://schemas.microsoft.com/office/drawing/2015/9/8/chartex" xmlns:cx2="http://schemas.microsoft.com/office/drawing/2015/10/21/chartex" xmlns:cx3="http://schemas.microsoft.com/office/drawing/2016/5/9/chartex" xmlns:cx4="http://schemas.microsoft.com/office/drawing/2016/5/10/chartex" xmlns:cx5="http://schemas.microsoft.com/office/drawing/2016/5/11/chartex" xmlns:cx6="http://schemas.microsoft.com/office/drawing/2016/5/12/chartex" xmlns:cx7="http://schemas.microsoft.com/office/drawing/2016/5/13/chartex" xmlns:cx8="http://schemas.microsoft.com/office/drawing/2016/5/14/chartex" xmlns:mc="http://schemas.openxmlformats.org/markup-compatibility/2006" xmlns:aink="http://schemas.microsoft.com/office/drawing/2016/ink" xmlns:am3d="http://schemas.microsoft.com/office/drawing/2017/model3d" xmlns:o="urn:schemas-microsoft-com:office:office" xmlns:r="http://schemas.openxmlformats.org/officeDocument/2006/relationships" xmlns:m="http://schemas.openxmlformats.org/officeDocument/2006/math" xmlns:v="urn:schemas-microsoft-com:vml" xmlns:wp14="http://schemas.microsoft.com/office/word/2010/wordprocessingDrawing" xmlns:wp="http://schemas.openxmlformats.org/drawingml/2006/wordprocessingDrawing" xmlns:w10="urn:schemas-microsoft-com:office:word" xmlns:w="http://schemas.openxmlformats.org/wordprocessingml/2006/main" xmlns:w14="http://schemas.microsoft.com/office/word/2010/wordml" xmlns:w15="http://schemas.microsoft.com/office/word/2012/wordml" xmlns:w16cid="http://schemas.microsoft.com/office/word/2016/wordml/cid" xmlns:w16se="http://schemas.microsoft.com/office/word/2015/wordml/symex" xmlns:wpg="http://schemas.microsoft.com/office/word/2010/wordprocessingGroup" xmlns:wpi="http://schemas.microsoft.com/office/word/2010/wordprocessingInk" xmlns:wne="http://schemas.microsoft.com/office/word/2006/wordml" xmlns:wps="http://schemas.microsoft.com/office/word/2010/wordprocessingShape" mc:Ignorable="w14 w15 w16se w16cid wp14">
+  <w:p>
+    <w:pPr>
+      <w:pStyle w:val="Header"/>
+    </w:pPr>
+  </w:p>
+</w:hdr>
 </file>
 
 <file path=word/numbering.xml><?xml version="1.0" encoding="utf-8"?>
@@ -3156,6 +3220,48 @@
       <w:szCs w:val="20"/>
     </w:rPr>
   </w:style>
+  <w:style w:type="paragraph" w:styleId="Header">
+    <w:name w:val="header"/>
+    <w:basedOn w:val="Normal"/>
+    <w:link w:val="HeaderChar"/>
+    <w:uiPriority w:val="99"/>
+    <w:unhideWhenUsed/>
+    <w:rsid w:val="004719C0"/>
+    <w:pPr>
+      <w:tabs>
+        <w:tab w:val="center" w:pos="4513"/>
+        <w:tab w:val="right" w:pos="9026"/>
+      </w:tabs>
+    </w:pPr>
+  </w:style>
+  <w:style w:type="character" w:customStyle="1" w:styleId="HeaderChar">
+    <w:name w:val="Header Char"/>
+    <w:basedOn w:val="DefaultParagraphFont"/>
+    <w:link w:val="Header"/>
+    <w:uiPriority w:val="99"/>
+    <w:rsid w:val="004719C0"/>
+  </w:style>
+  <w:style w:type="paragraph" w:styleId="Footer">
+    <w:name w:val="footer"/>
+    <w:basedOn w:val="Normal"/>
+    <w:link w:val="FooterChar"/>
+    <w:uiPriority w:val="99"/>
+    <w:unhideWhenUsed/>
+    <w:rsid w:val="004719C0"/>
+    <w:pPr>
+      <w:tabs>
+        <w:tab w:val="center" w:pos="4513"/>
+        <w:tab w:val="right" w:pos="9026"/>
+      </w:tabs>
+    </w:pPr>
+  </w:style>
+  <w:style w:type="character" w:customStyle="1" w:styleId="FooterChar">
+    <w:name w:val="Footer Char"/>
+    <w:basedOn w:val="DefaultParagraphFont"/>
+    <w:link w:val="Footer"/>
+    <w:uiPriority w:val="99"/>
+    <w:rsid w:val="004719C0"/>
+  </w:style>
 </w:styles>
 </file>
 

</xml_diff>